<commit_message>
Usuń ostatnie ślady terminu 14 dni: nagłówek M9, agenda, komentarz sceny
Co-Authored-By: Claude Fable 5.1 <noreply@anthropic.com>
Claude-Session: https://claude.ai/code/session_015kcLCwG7agccLWfRSEUYic
</commit_message>
<xml_diff>
--- a/film/Agenda_szkolenia_120min.docx
+++ b/film/Agenda_szkolenia_120min.docx
@@ -2301,7 +2301,7 @@
                 <w:sz w:val="18"/>
                 <w:szCs w:val="18"/>
               </w:rPr>
-              <w:t xml:space="preserve">Ocena → program → cele SMART (czym są, czy wymagane) → ewaluacja → informacja dla poradni.</w:t>
+              <w:t xml:space="preserve">Ocena → program → cele SMART (czym są, czy wymagane) → ewaluacja → opinia o funkcjonowaniu dziecka dla poradni (10 dni, § 7 ust. 3).</w:t>
             </w:r>
           </w:p>
         </w:tc>
@@ -2641,7 +2641,7 @@
                 <w:sz w:val="18"/>
                 <w:szCs w:val="18"/>
               </w:rPr>
-              <w:t xml:space="preserve">„Szkic w 7 minut": punkty 2, 4 i 6 informacji o funkcjonowaniu dziecka; mocne strony PIERWSZE i nie krótsze niż trudności.</w:t>
+              <w:t xml:space="preserve">„Szkic w 7 minut": punkty 2, 4 i 6 opinii o funkcjonowaniu dziecka; mocne strony PIERWSZE i nie krótsze niż trudności.</w:t>
             </w:r>
           </w:p>
         </w:tc>
@@ -2674,7 +2674,7 @@
                 <w:sz w:val="18"/>
                 <w:szCs w:val="18"/>
               </w:rPr>
-              <w:t xml:space="preserve">wzór informacji</w:t>
+              <w:t xml:space="preserve">wzór opinii</w:t>
             </w:r>
           </w:p>
         </w:tc>

</xml_diff>

<commit_message>
Agenda: czasy modułów po rozszerzeniach
Co-Authored-By: Claude Fable 5.1 <noreply@anthropic.com>
Claude-Session: https://claude.ai/code/session_015kcLCwG7agccLWfRSEUYic
</commit_message>
<xml_diff>
--- a/film/Agenda_szkolenia_120min.docx
+++ b/film/Agenda_szkolenia_120min.docx
@@ -672,7 +672,7 @@
                 <w:sz w:val="18"/>
                 <w:szCs w:val="18"/>
               </w:rPr>
-              <w:t xml:space="preserve">0:05–0:12</w:t>
+              <w:t xml:space="preserve">0:05–0:13</w:t>
             </w:r>
           </w:p>
         </w:tc>
@@ -771,7 +771,7 @@
                 <w:sz w:val="18"/>
                 <w:szCs w:val="18"/>
               </w:rPr>
-              <w:t xml:space="preserve">Podstawa prawna — co obowiązuje od 1 września 2026. STOP po ostatniej planszy „Trzy zdania na zamknięcie".</w:t>
+              <w:t xml:space="preserve">Podstawa prawna — co obowiązuje od 1 września 2026; § 7 ust. 3 rozporządzenia o orzekaniu (10 dni). STOP po planszy „Trzy zdania na zamknięcie".</w:t>
             </w:r>
           </w:p>
         </w:tc>
@@ -842,7 +842,7 @@
                 <w:sz w:val="18"/>
                 <w:szCs w:val="18"/>
               </w:rPr>
-              <w:t xml:space="preserve">0:12–0:24</w:t>
+              <w:t xml:space="preserve">0:13–0:23</w:t>
             </w:r>
           </w:p>
         </w:tc>
@@ -1012,7 +1012,7 @@
                 <w:sz w:val="18"/>
                 <w:szCs w:val="18"/>
               </w:rPr>
-              <w:t xml:space="preserve">0:24–0:30</w:t>
+              <w:t xml:space="preserve">0:23–0:29</w:t>
             </w:r>
           </w:p>
         </w:tc>
@@ -1111,7 +1111,7 @@
                 <w:sz w:val="18"/>
                 <w:szCs w:val="18"/>
               </w:rPr>
-              <w:t xml:space="preserve">Obieg dokumentów — sześć przystanków. STOP po planszy „Zapamiętajmy kolejność".</w:t>
+              <w:t xml:space="preserve">Obieg dokumentów — sześć przystanków, cztery narzędzia obserwacji pogłębionej. STOP po planszy „Zapamiętajmy kolejność".</w:t>
             </w:r>
           </w:p>
         </w:tc>
@@ -1182,7 +1182,7 @@
                 <w:sz w:val="18"/>
                 <w:szCs w:val="18"/>
               </w:rPr>
-              <w:t xml:space="preserve">0:30–0:35</w:t>
+              <w:t xml:space="preserve">0:29–0:35</w:t>
             </w:r>
           </w:p>
         </w:tc>
@@ -1281,7 +1281,7 @@
                 <w:sz w:val="18"/>
                 <w:szCs w:val="18"/>
               </w:rPr>
-              <w:t xml:space="preserve">Metryczka — zasadność i wypełnianie krok po kroku (animacja druku).</w:t>
+              <w:t xml:space="preserve">Metryczka — zasadność i wypełnianie krok po kroku (animacja druku; bez PESEL, z podstawą orzeczenia i chorobami przewlekłymi).</w:t>
             </w:r>
           </w:p>
         </w:tc>
@@ -1522,7 +1522,7 @@
                 <w:sz w:val="18"/>
                 <w:szCs w:val="18"/>
               </w:rPr>
-              <w:t xml:space="preserve">0:45–0:53</w:t>
+              <w:t xml:space="preserve">0:45–0:55</w:t>
             </w:r>
           </w:p>
         </w:tc>
@@ -1621,7 +1621,7 @@
                 <w:sz w:val="18"/>
                 <w:szCs w:val="18"/>
               </w:rPr>
-              <w:t xml:space="preserve">KPOF — budowa, skala, siedem zasad, wypełnianie, liczenie, profil. STOP po planszy „dwa razy w roku".</w:t>
+              <w:t xml:space="preserve">KPOF — ICF i profil biopsychospołeczny, budowa, skala, siedem zasad, wypełnianie, liczenie, profil. STOP po planszy „dwa razy w roku".</w:t>
             </w:r>
           </w:p>
         </w:tc>
@@ -1692,7 +1692,7 @@
                 <w:sz w:val="18"/>
                 <w:szCs w:val="18"/>
               </w:rPr>
-              <w:t xml:space="preserve">0:53–1:07</w:t>
+              <w:t xml:space="preserve">0:55–1:07</w:t>
             </w:r>
           </w:p>
         </w:tc>
@@ -1862,7 +1862,7 @@
                 <w:sz w:val="18"/>
                 <w:szCs w:val="18"/>
               </w:rPr>
-              <w:t xml:space="preserve">1:07–1:14</w:t>
+              <w:t xml:space="preserve">1:07–1:17</w:t>
             </w:r>
           </w:p>
         </w:tc>
@@ -1994,7 +1994,7 @@
                 <w:sz w:val="18"/>
                 <w:szCs w:val="18"/>
               </w:rPr>
-              <w:t xml:space="preserve">Z4 karta decyzyjna</w:t>
+              <w:t xml:space="preserve">Z4 karta decyzyjna, karta mowy</w:t>
             </w:r>
           </w:p>
         </w:tc>
@@ -2032,7 +2032,7 @@
                 <w:sz w:val="18"/>
                 <w:szCs w:val="18"/>
               </w:rPr>
-              <w:t xml:space="preserve">1:14–1:22</w:t>
+              <w:t xml:space="preserve">1:17–1:24</w:t>
             </w:r>
           </w:p>
         </w:tc>
@@ -2131,7 +2131,7 @@
                 <w:sz w:val="18"/>
                 <w:szCs w:val="18"/>
               </w:rPr>
-              <w:t xml:space="preserve">Trzy kazusy z modułu M6 scenariusza: która reguła, który moduł, którego NIE uruchamiamy i dlaczego.</w:t>
+              <w:t xml:space="preserve">Cztery kazusy z modułu M6 scenariusza: która reguła, które narzędzie, którego NIE uruchamiamy i dlaczego.</w:t>
             </w:r>
           </w:p>
         </w:tc>
@@ -2202,7 +2202,7 @@
                 <w:sz w:val="18"/>
                 <w:szCs w:val="18"/>
               </w:rPr>
-              <w:t xml:space="preserve">1:22–1:32</w:t>
+              <w:t xml:space="preserve">1:24–1:37</w:t>
             </w:r>
           </w:p>
         </w:tc>
@@ -2301,7 +2301,7 @@
                 <w:sz w:val="18"/>
                 <w:szCs w:val="18"/>
               </w:rPr>
-              <w:t xml:space="preserve">Ocena → program → cele SMART (czym są, czy wymagane) → ewaluacja → opinia o funkcjonowaniu dziecka dla poradni (10 dni, § 7 ust. 3).</w:t>
+              <w:t xml:space="preserve">Ocena → IPET (zalecenia z orzeczenia i WOPF, dostosowania, zintegrowane działania, sala) → cele SMART → ewaluacja → opinia o funkcjonowaniu dziecka dla poradni (10 dni, § 7 ust. 3).</w:t>
             </w:r>
           </w:p>
         </w:tc>
@@ -2372,7 +2372,7 @@
                 <w:sz w:val="18"/>
                 <w:szCs w:val="18"/>
               </w:rPr>
-              <w:t xml:space="preserve">1:32–1:45</w:t>
+              <w:t xml:space="preserve">1:37–1:48</w:t>
             </w:r>
           </w:p>
         </w:tc>
@@ -2542,7 +2542,7 @@
                 <w:sz w:val="18"/>
                 <w:szCs w:val="18"/>
               </w:rPr>
-              <w:t xml:space="preserve">1:45–1:52</w:t>
+              <w:t xml:space="preserve">1:48–1:54</w:t>
             </w:r>
           </w:p>
         </w:tc>
@@ -2641,7 +2641,7 @@
                 <w:sz w:val="18"/>
                 <w:szCs w:val="18"/>
               </w:rPr>
-              <w:t xml:space="preserve">„Szkic w 7 minut": punkty 2, 4 i 6 opinii o funkcjonowaniu dziecka; mocne strony PIERWSZE i nie krótsze niż trudności.</w:t>
+              <w:t xml:space="preserve">„Szkic w 6 minut": punkty 2, 4 i 6 opinii o funkcjonowaniu dziecka; mocne strony PIERWSZE i nie krótsze niż trudności.</w:t>
             </w:r>
           </w:p>
         </w:tc>
@@ -2712,7 +2712,7 @@
                 <w:sz w:val="18"/>
                 <w:szCs w:val="18"/>
               </w:rPr>
-              <w:t xml:space="preserve">1:52–2:00</w:t>
+              <w:t xml:space="preserve">1:54–2:00</w:t>
             </w:r>
           </w:p>
         </w:tc>
@@ -3143,7 +3143,7 @@
                 <w:sz w:val="18"/>
                 <w:szCs w:val="18"/>
               </w:rPr>
-              <w:t xml:space="preserve">7 min 25 s</w:t>
+              <w:t xml:space="preserve">7:36</w:t>
             </w:r>
           </w:p>
         </w:tc>
@@ -3176,7 +3176,7 @@
                 <w:sz w:val="18"/>
                 <w:szCs w:val="18"/>
               </w:rPr>
-              <w:t xml:space="preserve">Sąd nad dokumentem · 12 min</w:t>
+              <w:t xml:space="preserve">Sąd nad dokumentem · 10 min</w:t>
             </w:r>
           </w:p>
         </w:tc>
@@ -3280,7 +3280,7 @@
                 <w:sz w:val="18"/>
                 <w:szCs w:val="18"/>
               </w:rPr>
-              <w:t xml:space="preserve">5 min 50 s</w:t>
+              <w:t xml:space="preserve">5:36</w:t>
             </w:r>
           </w:p>
         </w:tc>
@@ -3417,7 +3417,7 @@
                 <w:sz w:val="18"/>
                 <w:szCs w:val="18"/>
               </w:rPr>
-              <w:t xml:space="preserve">4 min 53 s</w:t>
+              <w:t xml:space="preserve">5:45</w:t>
             </w:r>
           </w:p>
         </w:tc>
@@ -3521,7 +3521,7 @@
                 <w:sz w:val="18"/>
                 <w:szCs w:val="18"/>
               </w:rPr>
-              <w:t xml:space="preserve">Kwestionariusz KPOF</w:t>
+              <w:t xml:space="preserve">Kwestionariusz KPOF, ICF i profil biopsychospołeczny</w:t>
             </w:r>
           </w:p>
         </w:tc>
@@ -3554,7 +3554,7 @@
                 <w:sz w:val="18"/>
                 <w:szCs w:val="18"/>
               </w:rPr>
-              <w:t xml:space="preserve">7 min 48 s</w:t>
+              <w:t xml:space="preserve">10:08</w:t>
             </w:r>
           </w:p>
         </w:tc>
@@ -3587,7 +3587,7 @@
                 <w:sz w:val="18"/>
                 <w:szCs w:val="18"/>
               </w:rPr>
-              <w:t xml:space="preserve">Policz i zdecyduj · 14 min</w:t>
+              <w:t xml:space="preserve">Policz i zdecyduj · 12 min</w:t>
             </w:r>
           </w:p>
         </w:tc>
@@ -3658,7 +3658,7 @@
                 <w:sz w:val="18"/>
                 <w:szCs w:val="18"/>
               </w:rPr>
-              <w:t xml:space="preserve">Obserwacja pogłębiona</w:t>
+              <w:t xml:space="preserve">Obserwacja pogłębiona — cztery narzędzia</w:t>
             </w:r>
           </w:p>
         </w:tc>
@@ -3691,7 +3691,7 @@
                 <w:sz w:val="18"/>
                 <w:szCs w:val="18"/>
               </w:rPr>
-              <w:t xml:space="preserve">6 min 54 s</w:t>
+              <w:t xml:space="preserve">9:46</w:t>
             </w:r>
           </w:p>
         </w:tc>
@@ -3724,7 +3724,7 @@
                 <w:sz w:val="18"/>
                 <w:szCs w:val="18"/>
               </w:rPr>
-              <w:t xml:space="preserve">Kazusy · 8 min</w:t>
+              <w:t xml:space="preserve">Kazusy · 7 min</w:t>
             </w:r>
           </w:p>
         </w:tc>
@@ -3795,7 +3795,7 @@
                 <w:sz w:val="18"/>
                 <w:szCs w:val="18"/>
               </w:rPr>
-              <w:t xml:space="preserve">Ocena · program · SMART · ewaluacja · poradnia</w:t>
+              <w:t xml:space="preserve">Ocena · IPET · dostosowania · SMART · ewaluacja · opinia dla poradni</w:t>
             </w:r>
           </w:p>
         </w:tc>
@@ -3828,7 +3828,7 @@
                 <w:sz w:val="18"/>
                 <w:szCs w:val="18"/>
               </w:rPr>
-              <w:t xml:space="preserve">9 min 37 s</w:t>
+              <w:t xml:space="preserve">13:12</w:t>
             </w:r>
           </w:p>
         </w:tc>
@@ -3861,7 +3861,7 @@
                 <w:sz w:val="18"/>
                 <w:szCs w:val="18"/>
               </w:rPr>
-              <w:t xml:space="preserve">Trzy cele · 13 min + Szkic · 7 min</w:t>
+              <w:t xml:space="preserve">Trzy cele · 11 min + Szkic · 6 min</w:t>
             </w:r>
           </w:p>
         </w:tc>

</xml_diff>

<commit_message>
M1: czy placówka musi zmieniać istniejącą dokumentację — uzasadnienie na początku modułu
- narracja M1: trzy nowe akapity (odpowiedź, trzy powody zmian, z czym się to wiąże) nagrane i wklejone po akapicie 2; nowe sceny tytuł/lista/porównanie; ponowne wyrównanie (M1 = 9:30)
- scenariusz c1.js: sekcja „Zanim zaczniemy — czy placówka, która ma już szczegółową dokumentację, musi ją zmieniać?” z tabelą trzech powodów i ramką robimy/nie robimy
- agenda: blok M1 0:05–0:15, ćwiczenie 0:15–0:23, czas filmu 9:30

Co-Authored-By: Claude Fable 5.1 <noreply@anthropic.com>
Claude-Session: https://claude.ai/code/session_015kcLCwG7agccLWfRSEUYic
</commit_message>
<xml_diff>
--- a/film/Agenda_szkolenia_120min.docx
+++ b/film/Agenda_szkolenia_120min.docx
@@ -672,7 +672,7 @@
                 <w:sz w:val="18"/>
                 <w:szCs w:val="18"/>
               </w:rPr>
-              <w:t xml:space="preserve">0:05–0:13</w:t>
+              <w:t xml:space="preserve">0:05–0:15</w:t>
             </w:r>
           </w:p>
         </w:tc>
@@ -771,7 +771,7 @@
                 <w:sz w:val="18"/>
                 <w:szCs w:val="18"/>
               </w:rPr>
-              <w:t xml:space="preserve">Podstawa prawna — co obowiązuje od 1 września 2026; § 7 ust. 3 rozporządzenia o orzekaniu (10 dni). STOP po planszy „Trzy zdania na zamknięcie".</w:t>
+              <w:t xml:space="preserve">Czy musimy zmieniać dokumentację, którą już mamy (trzy powody, z czym się to wiąże); podstawa prawna — co obowiązuje od 1 września 2026; § 7 ust. 3 rozporządzenia o orzekaniu (10 dni). STOP po planszy „Trzy zdania na zamknięcie".</w:t>
             </w:r>
           </w:p>
         </w:tc>
@@ -842,7 +842,7 @@
                 <w:sz w:val="18"/>
                 <w:szCs w:val="18"/>
               </w:rPr>
-              <w:t xml:space="preserve">0:13–0:23</w:t>
+              <w:t xml:space="preserve">0:15–0:23</w:t>
             </w:r>
           </w:p>
         </w:tc>
@@ -3110,7 +3110,7 @@
                 <w:sz w:val="18"/>
                 <w:szCs w:val="18"/>
               </w:rPr>
-              <w:t xml:space="preserve">Podstawa prawna</w:t>
+              <w:t xml:space="preserve">Czy zmieniać dokumentację · podstawa prawna</w:t>
             </w:r>
           </w:p>
         </w:tc>
@@ -3143,7 +3143,7 @@
                 <w:sz w:val="18"/>
                 <w:szCs w:val="18"/>
               </w:rPr>
-              <w:t xml:space="preserve">7:36</w:t>
+              <w:t xml:space="preserve">9:30</w:t>
             </w:r>
           </w:p>
         </w:tc>
@@ -3176,7 +3176,7 @@
                 <w:sz w:val="18"/>
                 <w:szCs w:val="18"/>
               </w:rPr>
-              <w:t xml:space="preserve">Sąd nad dokumentem · 10 min</w:t>
+              <w:t xml:space="preserve">Sąd nad dokumentem · 8 min</w:t>
             </w:r>
           </w:p>
         </w:tc>

</xml_diff>